<commit_message>
Final commit to GitHub - updating the excel file
</commit_message>
<xml_diff>
--- a/Azure Load balanced web app.docx
+++ b/Azure Load balanced web app.docx
@@ -282,31 +282,6 @@
     </w:p>
     <w:p>
       <w:pPr>
-        <w:ind w:left="720"/>
-      </w:pPr>
-    </w:p>
-    <w:p>
-      <w:pPr>
-        <w:ind w:left="720"/>
-      </w:pPr>
-    </w:p>
-    <w:p>
-      <w:pPr>
-        <w:ind w:left="720"/>
-      </w:pPr>
-    </w:p>
-    <w:p>
-      <w:pPr>
-        <w:ind w:left="720"/>
-      </w:pPr>
-    </w:p>
-    <w:p>
-      <w:pPr>
-        <w:ind w:left="720"/>
-      </w:pPr>
-    </w:p>
-    <w:p>
-      <w:pPr>
         <w:rPr>
           <w:b/>
           <w:bCs/>
@@ -317,6 +292,7 @@
           <w:b/>
           <w:bCs/>
         </w:rPr>
+        <w:lastRenderedPageBreak/>
         <w:t>Architecture</w:t>
       </w:r>
     </w:p>
@@ -332,7 +308,6 @@
         <w:rPr>
           <w:noProof/>
         </w:rPr>
-        <w:lastRenderedPageBreak/>
         <w:drawing>
           <wp:inline distT="0" distB="0" distL="0" distR="0" wp14:anchorId="553B6B1D" wp14:editId="222381D1">
             <wp:extent cx="3879781" cy="5334000"/>
@@ -385,6 +360,7 @@
     </w:p>
     <w:p>
       <w:r>
+        <w:lastRenderedPageBreak/>
         <w:t>Shown in the hand-drawn image.</w:t>
       </w:r>
     </w:p>
@@ -400,7 +376,6 @@
           <w:b/>
           <w:bCs/>
         </w:rPr>
-        <w:lastRenderedPageBreak/>
         <w:t>How to run</w:t>
       </w:r>
     </w:p>
@@ -740,6 +715,7 @@
         </w:rPr>
       </w:pPr>
       <w:r>
+        <w:lastRenderedPageBreak/>
         <w:t>modules</w:t>
       </w:r>
     </w:p>
@@ -756,7 +732,6 @@
         </w:rPr>
       </w:pPr>
       <w:r>
-        <w:lastRenderedPageBreak/>
         <w:t>compute</w:t>
       </w:r>
     </w:p>
@@ -934,6 +909,9 @@
         <w:jc w:val="center"/>
       </w:pPr>
       <w:r>
+        <w:rPr>
+          <w:noProof/>
+        </w:rPr>
         <w:drawing>
           <wp:inline distT="0" distB="0" distL="0" distR="0" wp14:anchorId="3ECE1A0A" wp14:editId="546DCF98">
             <wp:extent cx="8705850" cy="1658992"/>
@@ -994,7 +972,7 @@
           <w:noProof/>
         </w:rPr>
         <w:drawing>
-          <wp:inline distT="0" distB="0" distL="0" distR="0" wp14:anchorId="6265F79D" wp14:editId="62AB5D4C">
+          <wp:inline distT="0" distB="0" distL="0" distR="0" wp14:anchorId="6265F79D" wp14:editId="36EFC8FC">
             <wp:extent cx="5724525" cy="1990725"/>
             <wp:effectExtent l="0" t="0" r="9525" b="9525"/>
             <wp:docPr id="1219302920" name="Picture 1"/>

</xml_diff>